<commit_message>
update readme files and removed autosaves
</commit_message>
<xml_diff>
--- a/Code/Matlab/Mesh_Optimization/Mesh_Optimization_Readme.docx
+++ b/Code/Matlab/Mesh_Optimization/Mesh_Optimization_Readme.docx
@@ -16,6 +16,7 @@
         </w:rPr>
         <w:t xml:space="preserve">Folder: </w:t>
       </w:r>
+      <w:proofErr w:type="spellStart"/>
       <w:r>
         <w:rPr>
           <w:b/>
@@ -23,10 +24,19 @@
         </w:rPr>
         <w:t>Mesh_Optimization</w:t>
       </w:r>
-    </w:p>
-    <w:p>
-      <w:r>
-        <w:t xml:space="preserve">This folder contains scripts that optimize the PAM placement by using points contained in the mesh files that define the structure of the OpenSim bone models. </w:t>
+      <w:proofErr w:type="spellEnd"/>
+    </w:p>
+    <w:p>
+      <w:r>
+        <w:t xml:space="preserve">This folder contains scripts that optimize the PAM placement by using points contained in the mesh files that define the structure of the </w:t>
+      </w:r>
+      <w:proofErr w:type="spellStart"/>
+      <w:r>
+        <w:t>OpenSim</w:t>
+      </w:r>
+      <w:proofErr w:type="spellEnd"/>
+      <w:r>
+        <w:t xml:space="preserve"> bone models. </w:t>
       </w:r>
     </w:p>
     <w:p>
@@ -37,49 +47,30 @@
     <w:p/>
     <w:p>
       <w:pPr>
-        <w:rPr>
-          <w:b/>
-          <w:bCs/>
-          <w:u w:val="single"/>
-        </w:rPr>
-      </w:pPr>
-      <w:r>
-        <w:rPr>
-          <w:b/>
-          <w:bCs/>
-          <w:u w:val="single"/>
-        </w:rPr>
+        <w:pStyle w:val="Heading1"/>
+      </w:pPr>
+      <w:r>
         <w:t>Files and Descriptions:</w:t>
       </w:r>
     </w:p>
     <w:p>
       <w:pPr>
-        <w:rPr>
-          <w:u w:val="single"/>
-        </w:rPr>
-      </w:pPr>
-      <w:r>
-        <w:rPr>
-          <w:u w:val="single"/>
-        </w:rPr>
+        <w:pStyle w:val="Heading2"/>
+      </w:pPr>
+      <w:r>
         <w:t>Newer optimization files (Bolen et al. 2026)</w:t>
       </w:r>
     </w:p>
     <w:p>
       <w:pPr>
-        <w:ind w:firstLine="720"/>
-        <w:rPr>
-          <w:u w:val="single"/>
-        </w:rPr>
-      </w:pPr>
-      <w:r>
-        <w:rPr>
-          <w:u w:val="single"/>
-        </w:rPr>
+        <w:pStyle w:val="Heading3"/>
+      </w:pPr>
+      <w:r>
         <w:t>For the Flexor:</w:t>
       </w:r>
     </w:p>
     <w:p>
+      <w:proofErr w:type="spellStart"/>
       <w:r>
         <w:rPr>
           <w:b/>
@@ -87,6 +78,7 @@
         </w:rPr>
         <w:t>Opt_run.m</w:t>
       </w:r>
+      <w:proofErr w:type="spellEnd"/>
       <w:r>
         <w:t xml:space="preserve"> </w:t>
       </w:r>
@@ -99,6 +91,7 @@
       </w:r>
     </w:p>
     <w:p>
+      <w:proofErr w:type="spellStart"/>
       <w:r>
         <w:rPr>
           <w:b/>
@@ -120,6 +113,7 @@
         </w:rPr>
         <w:t>.m</w:t>
       </w:r>
+      <w:proofErr w:type="spellEnd"/>
       <w:r>
         <w:t xml:space="preserve"> </w:t>
       </w:r>
@@ -168,6 +162,7 @@
       </w:r>
     </w:p>
     <w:p>
+      <w:proofErr w:type="spellStart"/>
       <w:r>
         <w:rPr>
           <w:b/>
@@ -175,6 +170,7 @@
         </w:rPr>
         <w:t>buildGeoExclusion.m</w:t>
       </w:r>
+      <w:proofErr w:type="spellEnd"/>
       <w:r>
         <w:tab/>
       </w:r>
@@ -184,6 +180,7 @@
       </w:r>
     </w:p>
     <w:p>
+      <w:proofErr w:type="spellStart"/>
       <w:r>
         <w:rPr>
           <w:b/>
@@ -191,6 +188,7 @@
         </w:rPr>
         <w:t>nonlconExclusion.m</w:t>
       </w:r>
+      <w:proofErr w:type="spellEnd"/>
       <w:r>
         <w:tab/>
       </w:r>
@@ -206,6 +204,7 @@
           <w:bCs/>
         </w:rPr>
       </w:pPr>
+      <w:proofErr w:type="spellStart"/>
       <w:r>
         <w:rPr>
           <w:b/>
@@ -227,29 +226,35 @@
         </w:rPr>
         <w:t>m</w:t>
       </w:r>
+      <w:proofErr w:type="spellEnd"/>
       <w:r>
         <w:t xml:space="preserve">       % </w:t>
       </w:r>
       <w:r>
-        <w:t>Objective/constraint wrapper for surrogateopt</w:t>
-      </w:r>
-    </w:p>
-    <w:p>
-      <w:pPr>
-        <w:ind w:firstLine="720"/>
-      </w:pPr>
-      <w:r>
-        <w:rPr>
-          <w:u w:val="single"/>
+        <w:t xml:space="preserve">Objective/constraint wrapper for </w:t>
+      </w:r>
+      <w:proofErr w:type="spellStart"/>
+      <w:r>
+        <w:t>surrogateopt</w:t>
+      </w:r>
+      <w:proofErr w:type="spellEnd"/>
+    </w:p>
+    <w:p>
+      <w:pPr>
+        <w:pStyle w:val="Heading3"/>
+      </w:pPr>
+      <w:r>
+        <w:rPr>
+          <w:rStyle w:val="Heading2Char"/>
         </w:rPr>
         <w:t>For the Extensor:</w:t>
       </w:r>
       <w:r>
         <w:tab/>
-        <w:t>(This includes the X3 for BPA bending)</w:t>
-      </w:r>
-    </w:p>
-    <w:p>
+      </w:r>
+    </w:p>
+    <w:p>
+      <w:proofErr w:type="spellStart"/>
       <w:r>
         <w:rPr>
           <w:b/>
@@ -271,6 +276,7 @@
         </w:rPr>
         <w:t>.m</w:t>
       </w:r>
+      <w:proofErr w:type="spellEnd"/>
       <w:r>
         <w:t xml:space="preserve"> </w:t>
       </w:r>
@@ -283,6 +289,7 @@
       </w:r>
     </w:p>
     <w:p>
+      <w:proofErr w:type="spellStart"/>
       <w:r>
         <w:rPr>
           <w:b/>
@@ -304,6 +311,7 @@
         </w:rPr>
         <w:t>.m</w:t>
       </w:r>
+      <w:proofErr w:type="spellEnd"/>
       <w:r>
         <w:t xml:space="preserve"> </w:t>
       </w:r>
@@ -394,125 +402,116 @@
       </w:r>
     </w:p>
     <w:p>
-      <w:r>
-        <w:rPr>
-          <w:b/>
-          <w:bCs/>
-        </w:rPr>
-        <w:t>buildDistalRingLocation20mm.m</w:t>
-      </w:r>
-      <w:r>
-        <w:t xml:space="preserve">     %</w:t>
-      </w:r>
-      <w:r>
-        <w:t>Location cannot physically remain a function only of phiD_i anymore. p1 and p8 are optimization variables, so the routing points have to depend on them.</w:t>
-      </w:r>
-    </w:p>
-    <w:p>
-      <w:r>
-        <w:rPr>
-          <w:b/>
-          <w:bCs/>
-        </w:rPr>
-        <w:t>tendonLimit20mm.m</w:t>
-      </w:r>
-      <w:r>
-        <w:tab/>
-        <w:t>%geometry dependent tendon limit</w:t>
-      </w:r>
-    </w:p>
-    <w:p>
-      <w:r>
-        <w:rPr>
-          <w:b/>
-          <w:bCs/>
-        </w:rPr>
-        <w:t>nonlconExt20mm.m</w:t>
-      </w:r>
-      <w:r>
-        <w:tab/>
-        <w:t>%nonlinear geometry constraint (mostly for tendon)</w:t>
-      </w:r>
-    </w:p>
-    <w:p>
-      <w:r>
-        <w:rPr>
-          <w:b/>
-          <w:bCs/>
-        </w:rPr>
-        <w:t>objconstrExt20mm.m</w:t>
-      </w:r>
-      <w:r>
-        <w:tab/>
-        <w:t>%</w:t>
-      </w:r>
-      <w:r>
-        <w:t xml:space="preserve"> surrogateopt needs the nonlinear constraint bundled into the returned structure rather than passed in the patternsearch position.</w:t>
-      </w:r>
-    </w:p>
-    <w:p>
-      <w:r>
-        <w:rPr>
-          <w:b/>
-          <w:bCs/>
-        </w:rPr>
-        <w:lastRenderedPageBreak/>
-        <w:t>TestDynamicRoutePoints20mm.m</w:t>
-      </w:r>
-      <w:r>
-        <w:rPr>
-          <w:b/>
-          <w:bCs/>
-        </w:rPr>
-        <w:tab/>
-      </w:r>
-      <w:r>
-        <w:t>%See if the p1-p8 framework is viable or if we need to change it something else.</w:t>
-      </w:r>
-    </w:p>
-    <w:p/>
-    <w:p/>
-    <w:p>
-      <w:pPr>
-        <w:rPr>
-          <w:u w:val="single"/>
-        </w:rPr>
-      </w:pPr>
-      <w:r>
-        <w:rPr>
-          <w:u w:val="single"/>
-        </w:rPr>
-        <w:t>Used by Morrow et al.</w:t>
-      </w:r>
-      <w:r>
-        <w:rPr>
-          <w:u w:val="single"/>
-        </w:rPr>
-        <w:t xml:space="preserve"> (2020)</w:t>
-      </w:r>
-    </w:p>
-    <w:p>
-      <w:r>
-        <w:rPr>
-          <w:b/>
-          <w:bCs/>
+      <w:pPr>
+        <w:rPr>
+          <w:b/>
+        </w:rPr>
+      </w:pPr>
+    </w:p>
+    <w:p>
+      <w:pPr>
+        <w:pStyle w:val="Heading3"/>
+      </w:pPr>
+      <w:r>
+        <w:t>How the newer optimizer is organized</w:t>
+      </w:r>
+    </w:p>
+    <w:p>
+      <w:proofErr w:type="spellStart"/>
+      <w:r>
+        <w:rPr>
           <w:i/>
           <w:iCs/>
         </w:rPr>
-        <w:t>Muscle_Name</w:t>
-      </w:r>
-      <w:r>
-        <w:rPr>
-          <w:b/>
-          <w:bCs/>
-        </w:rPr>
-        <w:t>_Mesh_Opt.m</w:t>
-      </w:r>
-      <w:r>
-        <w:t xml:space="preserve"> – </w:t>
-      </w:r>
-      <w:r>
-        <w:t>These scripts use the skeletal mesh from OpenSim to determine the best placement for PAMs in order to replace one or more muscles. Each script follows the general structure:</w:t>
+        <w:t>ctx</w:t>
+      </w:r>
+      <w:proofErr w:type="spellEnd"/>
+      <w:r>
+        <w:t xml:space="preserve"> means context. It is an ordinary MATLAB struct, not a special MATLAB object. A context groups values that stay fixed during one run: angle grids, transforms, geometry, BPA and stiffness constants, target data, penalty settings, initial values, and bounds. The eight values that the optimizer changes remain in </w:t>
+      </w:r>
+      <w:r>
+        <w:rPr>
+          <w:i/>
+          <w:iCs/>
+        </w:rPr>
+        <w:t>x = [p1(1:3), pEnd(1:3), rest, tendon].</w:t>
+      </w:r>
+    </w:p>
+    <w:p>
+      <w:r>
+        <w:t xml:space="preserve">Related containers – </w:t>
+      </w:r>
+      <w:r>
+        <w:rPr>
+          <w:i/>
+          <w:iCs/>
+        </w:rPr>
+        <w:t>geo</w:t>
+      </w:r>
+      <w:r>
+        <w:t xml:space="preserve"> is the geometry portion of the context; </w:t>
+      </w:r>
+      <w:r>
+        <w:rPr>
+          <w:i/>
+          <w:iCs/>
+        </w:rPr>
+        <w:t>pred</w:t>
+      </w:r>
+      <w:r>
+        <w:t xml:space="preserve"> is the prediction returned for one candidate x; </w:t>
+      </w:r>
+      <w:r>
+        <w:rPr>
+          <w:i/>
+          <w:iCs/>
+        </w:rPr>
+        <w:t>routeCtx</w:t>
+      </w:r>
+      <w:r>
+        <w:t xml:space="preserve"> is the smaller saved flexor context needed to rebuild the accepted route later. </w:t>
+      </w:r>
+      <w:r>
+        <w:lastRenderedPageBreak/>
+        <w:t xml:space="preserve">Saving </w:t>
+      </w:r>
+      <w:r>
+        <w:rPr>
+          <w:i/>
+          <w:iCs/>
+        </w:rPr>
+        <w:t>ctx</w:t>
+      </w:r>
+      <w:r>
+        <w:t xml:space="preserve"> or </w:t>
+      </w:r>
+      <w:r>
+        <w:rPr>
+          <w:i/>
+          <w:iCs/>
+        </w:rPr>
+        <w:t>routeCtx</w:t>
+      </w:r>
+      <w:r>
+        <w:t xml:space="preserve"> with </w:t>
+      </w:r>
+      <w:r>
+        <w:rPr>
+          <w:i/>
+          <w:iCs/>
+        </w:rPr>
+        <w:t>xBest</w:t>
+      </w:r>
+      <w:r>
+        <w:t xml:space="preserve"> prevents a later analysis from silently using changed constants or geometry.</w:t>
+      </w:r>
+    </w:p>
+    <w:p>
+      <w:pPr>
+        <w:pStyle w:val="Heading3"/>
+      </w:pPr>
+      <w:r>
+        <w:t>Flexor optimizer call flow</w:t>
       </w:r>
     </w:p>
     <w:p>
@@ -524,7 +523,44 @@
         </w:numPr>
       </w:pPr>
       <w:r>
-        <w:t>Add file paths to the human muscle class structure, robot PAM class structure, functions folder, and OpenSim data folder</w:t>
+        <w:rPr>
+          <w:b/>
+          <w:bCs/>
+        </w:rPr>
+        <w:t>Opt_run.m</w:t>
+      </w:r>
+      <w:r>
+        <w:t xml:space="preserve"> calls </w:t>
+      </w:r>
+      <w:r>
+        <w:rPr>
+          <w:b/>
+          <w:bCs/>
+        </w:rPr>
+        <w:t>buildKneeFlexorContext20mm</w:t>
+      </w:r>
+      <w:r>
+        <w:t xml:space="preserve"> once to create </w:t>
+      </w:r>
+      <w:r>
+        <w:rPr>
+          <w:i/>
+          <w:iCs/>
+        </w:rPr>
+        <w:t>ctx</w:t>
+      </w:r>
+      <w:r>
+        <w:t xml:space="preserve"> and </w:t>
+      </w:r>
+      <w:r>
+        <w:rPr>
+          <w:i/>
+          <w:iCs/>
+        </w:rPr>
+        <w:t>ctx.geo</w:t>
+      </w:r>
+      <w:r>
+        <w:t>.</w:t>
       </w:r>
     </w:p>
     <w:p>
@@ -536,7 +572,47 @@
         </w:numPr>
       </w:pPr>
       <w:r>
-        <w:t xml:space="preserve">Creates transformation matrices for the joints that the muscles will cross over. These are made by creating a linearly spaced vector of angles between the joints minimum and maximum orientations. Those angles are then used to create a rotation matrix and then a transformation matrix by using the distance between the first point in a muscle’s reference frame and the following joint frames that the muscle crosses over into. </w:t>
+        <w:t xml:space="preserve">surrogateopt calls </w:t>
+      </w:r>
+      <w:r>
+        <w:rPr>
+          <w:b/>
+          <w:bCs/>
+        </w:rPr>
+        <w:t>objconstrExclusion</w:t>
+      </w:r>
+      <w:r>
+        <w:t xml:space="preserve">. That wrapper evaluates </w:t>
+      </w:r>
+      <w:r>
+        <w:rPr>
+          <w:b/>
+          <w:bCs/>
+        </w:rPr>
+        <w:t xml:space="preserve">predictKneeFlexor20mm </w:t>
+      </w:r>
+      <w:r>
+        <w:t xml:space="preserve">once and sends the same radius-coupled prediction to </w:t>
+      </w:r>
+      <w:r>
+        <w:rPr>
+          <w:b/>
+          <w:bCs/>
+        </w:rPr>
+        <w:t>objective_KneeFlexor20mm</w:t>
+      </w:r>
+      <w:r>
+        <w:t xml:space="preserve"> and </w:t>
+      </w:r>
+      <w:r>
+        <w:rPr>
+          <w:b/>
+          <w:bCs/>
+        </w:rPr>
+        <w:t>nonlconExclusion</w:t>
+      </w:r>
+      <w:r>
+        <w:t>.</w:t>
       </w:r>
     </w:p>
     <w:p>
@@ -548,7 +624,34 @@
         </w:numPr>
       </w:pPr>
       <w:r>
-        <w:t>Runs the class structure for the human muscles.</w:t>
+        <w:rPr>
+          <w:b/>
+          <w:bCs/>
+        </w:rPr>
+        <w:t>predictKneeFlexor20mm</w:t>
+      </w:r>
+      <w:r>
+        <w:t xml:space="preserve"> builds the route with </w:t>
+      </w:r>
+      <w:r>
+        <w:rPr>
+          <w:b/>
+          <w:bCs/>
+        </w:rPr>
+        <w:t>buildKneeFlexorRoute20mm</w:t>
+      </w:r>
+      <w:r>
+        <w:t xml:space="preserve">, constructs </w:t>
+      </w:r>
+      <w:r>
+        <w:rPr>
+          <w:b/>
+          <w:bCs/>
+        </w:rPr>
+        <w:t>MonoPamDataExplicit_balanceX3</w:t>
+      </w:r>
+      <w:r>
+        <w:t>, and returns torque, length, strain, wrap, and bpaR-radius diagnostics.</w:t>
       </w:r>
     </w:p>
     <w:p>
@@ -560,7 +663,37 @@
         </w:numPr>
       </w:pPr>
       <w:r>
-        <w:t>Runs the class structure for the PAM based on an initial starting point. This initial starting point is typically the same as the human muscle’s locations, but may have one or more points removed to make a more linear path.</w:t>
+        <w:t xml:space="preserve">patternsearch then refines the global result using </w:t>
+      </w:r>
+      <w:r>
+        <w:rPr>
+          <w:b/>
+          <w:bCs/>
+        </w:rPr>
+        <w:t>objective_KneeFlexor20mm</w:t>
+      </w:r>
+      <w:r>
+        <w:t xml:space="preserve"> and </w:t>
+      </w:r>
+      <w:r>
+        <w:rPr>
+          <w:b/>
+          <w:bCs/>
+        </w:rPr>
+        <w:t>nonlconExclusion</w:t>
+      </w:r>
+      <w:r>
+        <w:t xml:space="preserve"> with the same </w:t>
+      </w:r>
+      <w:r>
+        <w:rPr>
+          <w:i/>
+          <w:iCs/>
+        </w:rPr>
+        <w:t>ctx</w:t>
+      </w:r>
+      <w:r>
+        <w:t>.</w:t>
       </w:r>
     </w:p>
     <w:p>
@@ -572,6 +705,971 @@
         </w:numPr>
       </w:pPr>
       <w:r>
+        <w:t xml:space="preserve">After feasibility checks, </w:t>
+      </w:r>
+      <w:r>
+        <w:rPr>
+          <w:b/>
+          <w:bCs/>
+        </w:rPr>
+        <w:t>Opt_run.m</w:t>
+      </w:r>
+      <w:r>
+        <w:t xml:space="preserve"> packages </w:t>
+      </w:r>
+      <w:r>
+        <w:rPr>
+          <w:i/>
+          <w:iCs/>
+        </w:rPr>
+        <w:t>routeCtx</w:t>
+      </w:r>
+      <w:r>
+        <w:t xml:space="preserve">. Save </w:t>
+      </w:r>
+      <w:r>
+        <w:rPr>
+          <w:i/>
+          <w:iCs/>
+        </w:rPr>
+        <w:t>xBest</w:t>
+      </w:r>
+      <w:r>
+        <w:t xml:space="preserve">, </w:t>
+      </w:r>
+      <w:r>
+        <w:rPr>
+          <w:i/>
+          <w:iCs/>
+        </w:rPr>
+        <w:t>routeCtx</w:t>
+      </w:r>
+      <w:r>
+        <w:t xml:space="preserve">, and </w:t>
+      </w:r>
+      <w:r>
+        <w:rPr>
+          <w:i/>
+          <w:iCs/>
+        </w:rPr>
+        <w:t>Xi3</w:t>
+      </w:r>
+      <w:r>
+        <w:t xml:space="preserve"> in </w:t>
+      </w:r>
+      <w:r>
+        <w:rPr>
+          <w:i/>
+          <w:iCs/>
+        </w:rPr>
+        <w:t>Bifemsh_20mm_Result.mat</w:t>
+      </w:r>
+      <w:r>
+        <w:t xml:space="preserve"> for </w:t>
+      </w:r>
+      <w:r>
+        <w:rPr>
+          <w:i/>
+          <w:iCs/>
+        </w:rPr>
+        <w:t>Knee_Flexor_Data_20mm.m</w:t>
+      </w:r>
+      <w:r>
+        <w:t>.</w:t>
+      </w:r>
+    </w:p>
+    <w:p>
+      <w:pPr>
+        <w:pStyle w:val="Heading3"/>
+      </w:pPr>
+      <w:r>
+        <w:t>Extensor optimizer call flow</w:t>
+      </w:r>
+    </w:p>
+    <w:p>
+      <w:pPr>
+        <w:pStyle w:val="ListParagraph"/>
+        <w:numPr>
+          <w:ilvl w:val="0"/>
+          <w:numId w:val="8"/>
+        </w:numPr>
+      </w:pPr>
+      <w:r>
+        <w:rPr>
+          <w:b/>
+          <w:bCs/>
+        </w:rPr>
+        <w:t>Opt_run_Ext.m</w:t>
+      </w:r>
+      <w:r>
+        <w:t xml:space="preserve"> calls buildKneeExtContext20mm once to create ctx, including the nine-row route definition, extensor CAD geometry, OpenSim target, </w:t>
+      </w:r>
+      <w:r>
+        <w:rPr>
+          <w:i/>
+          <w:iCs/>
+        </w:rPr>
+        <w:t>Xi0-Xi3</w:t>
+      </w:r>
+      <w:r>
+        <w:t xml:space="preserve">, and </w:t>
+      </w:r>
+      <w:r>
+        <w:rPr>
+          <w:i/>
+          <w:iCs/>
+        </w:rPr>
+        <w:t>BPAcount</w:t>
+      </w:r>
+      <w:r>
+        <w:t>.</w:t>
+      </w:r>
+    </w:p>
+    <w:p>
+      <w:pPr>
+        <w:pStyle w:val="ListParagraph"/>
+        <w:numPr>
+          <w:ilvl w:val="0"/>
+          <w:numId w:val="8"/>
+        </w:numPr>
+      </w:pPr>
+      <w:r>
+        <w:t xml:space="preserve">surrogateopt calls </w:t>
+      </w:r>
+      <w:r>
+        <w:rPr>
+          <w:b/>
+          <w:bCs/>
+        </w:rPr>
+        <w:t>objconstrExt20mm</w:t>
+      </w:r>
+      <w:r>
+        <w:t xml:space="preserve">, which packages </w:t>
+      </w:r>
+      <w:r>
+        <w:rPr>
+          <w:b/>
+          <w:bCs/>
+        </w:rPr>
+        <w:t>objective_KneeExt20mm</w:t>
+      </w:r>
+      <w:r>
+        <w:t xml:space="preserve"> and </w:t>
+      </w:r>
+      <w:r>
+        <w:rPr>
+          <w:b/>
+          <w:bCs/>
+        </w:rPr>
+        <w:t>nonlconExt20mm</w:t>
+      </w:r>
+      <w:r>
+        <w:t xml:space="preserve"> in the structure required by surrogateopt.</w:t>
+      </w:r>
+    </w:p>
+    <w:p>
+      <w:pPr>
+        <w:pStyle w:val="ListParagraph"/>
+        <w:numPr>
+          <w:ilvl w:val="0"/>
+          <w:numId w:val="8"/>
+        </w:numPr>
+      </w:pPr>
+      <w:r>
+        <w:rPr>
+          <w:b/>
+          <w:bCs/>
+        </w:rPr>
+        <w:t>predictKneeExt20mm</w:t>
+      </w:r>
+      <w:r>
+        <w:t xml:space="preserve"> builds the changing route with </w:t>
+      </w:r>
+      <w:r>
+        <w:rPr>
+          <w:b/>
+          <w:bCs/>
+        </w:rPr>
+        <w:t>buildDistalRingLocation20mm</w:t>
+      </w:r>
+      <w:r>
+        <w:t xml:space="preserve">, evaluates </w:t>
+      </w:r>
+      <w:r>
+        <w:rPr>
+          <w:b/>
+          <w:bCs/>
+        </w:rPr>
+        <w:t>MonoPamDataExplicit_balanceX3</w:t>
+      </w:r>
+      <w:r>
+        <w:t>, and returns the same categories of prediction diagnostics.</w:t>
+      </w:r>
+    </w:p>
+    <w:p>
+      <w:pPr>
+        <w:pStyle w:val="ListParagraph"/>
+        <w:numPr>
+          <w:ilvl w:val="0"/>
+          <w:numId w:val="8"/>
+        </w:numPr>
+      </w:pPr>
+      <w:r>
+        <w:t xml:space="preserve">patternsearch refines the selected starting point. The adjusted-seed block in the supplied </w:t>
+      </w:r>
+      <w:proofErr w:type="spellStart"/>
+      <w:r>
+        <w:rPr>
+          <w:b/>
+          <w:bCs/>
+        </w:rPr>
+        <w:t>Opt_run_Ext.m</w:t>
+      </w:r>
+      <w:proofErr w:type="spellEnd"/>
+      <w:r>
+        <w:t xml:space="preserve"> is active and overwrites </w:t>
+      </w:r>
+      <w:proofErr w:type="spellStart"/>
+      <w:r>
+        <w:rPr>
+          <w:i/>
+          <w:iCs/>
+        </w:rPr>
+        <w:t>xBest</w:t>
+      </w:r>
+      <w:proofErr w:type="spellEnd"/>
+      <w:r>
+        <w:t xml:space="preserve"> unless it is commented out.</w:t>
+      </w:r>
+    </w:p>
+    <w:p>
+      <w:pPr>
+        <w:pStyle w:val="ListParagraph"/>
+        <w:numPr>
+          <w:ilvl w:val="0"/>
+          <w:numId w:val="8"/>
+        </w:numPr>
+      </w:pPr>
+      <w:r>
+        <w:t xml:space="preserve">Save </w:t>
+      </w:r>
+      <w:r>
+        <w:rPr>
+          <w:i/>
+          <w:iCs/>
+        </w:rPr>
+        <w:t>ctx</w:t>
+      </w:r>
+      <w:r>
+        <w:t xml:space="preserve"> and </w:t>
+      </w:r>
+      <w:r>
+        <w:rPr>
+          <w:i/>
+          <w:iCs/>
+        </w:rPr>
+        <w:t>xBest</w:t>
+      </w:r>
+      <w:r>
+        <w:t xml:space="preserve"> together in </w:t>
+      </w:r>
+      <w:r>
+        <w:rPr>
+          <w:b/>
+          <w:bCs/>
+        </w:rPr>
+        <w:t>Vas_Pam_20mm_Result.mat</w:t>
+      </w:r>
+      <w:r>
+        <w:t xml:space="preserve">. </w:t>
+      </w:r>
+      <w:r>
+        <w:rPr>
+          <w:b/>
+          <w:bCs/>
+        </w:rPr>
+        <w:t>Knee_Extensor_20mm.m</w:t>
+      </w:r>
+      <w:r>
+        <w:t xml:space="preserve"> intentionally reloads the saved </w:t>
+      </w:r>
+      <w:r>
+        <w:rPr>
+          <w:i/>
+          <w:iCs/>
+        </w:rPr>
+        <w:t>ctx</w:t>
+      </w:r>
+      <w:r>
+        <w:t xml:space="preserve"> rather than rebuilding it.</w:t>
+      </w:r>
+    </w:p>
+    <w:p>
+      <w:pPr>
+        <w:pStyle w:val="Heading3"/>
+      </w:pPr>
+      <w:r>
+        <w:t>Post-optimization, experiment, and plotting workflow</w:t>
+      </w:r>
+    </w:p>
+    <w:p>
+      <w:pPr>
+        <w:pStyle w:val="ListParagraph"/>
+        <w:numPr>
+          <w:ilvl w:val="0"/>
+          <w:numId w:val="10"/>
+        </w:numPr>
+      </w:pPr>
+      <w:r>
+        <w:rPr>
+          <w:u w:val="single"/>
+        </w:rPr>
+        <w:t>Flexor:</w:t>
+      </w:r>
+      <w:r>
+        <w:t xml:space="preserve"> run </w:t>
+      </w:r>
+      <w:proofErr w:type="spellStart"/>
+      <w:r>
+        <w:rPr>
+          <w:b/>
+          <w:bCs/>
+        </w:rPr>
+        <w:t>Opt_run.m</w:t>
+      </w:r>
+      <w:proofErr w:type="spellEnd"/>
+      <w:r>
+        <w:rPr>
+          <w:b/>
+          <w:bCs/>
+        </w:rPr>
+        <w:t>;</w:t>
+      </w:r>
+      <w:r>
+        <w:t xml:space="preserve"> accept and save </w:t>
+      </w:r>
+      <w:r>
+        <w:rPr>
+          <w:b/>
+          <w:bCs/>
+        </w:rPr>
+        <w:t>Bifemsh_20mm_Result.mat</w:t>
+      </w:r>
+      <w:r>
+        <w:t xml:space="preserve">; run </w:t>
+      </w:r>
+      <w:r>
+        <w:rPr>
+          <w:b/>
+          <w:bCs/>
+        </w:rPr>
+        <w:t>Knee_Flexor_Data_20mm.m</w:t>
+      </w:r>
+      <w:r>
+        <w:t xml:space="preserve"> (called </w:t>
+      </w:r>
+      <w:r>
+        <w:rPr>
+          <w:b/>
+          <w:bCs/>
+        </w:rPr>
+        <w:t>Knee_Flexor_20mm.m</w:t>
+      </w:r>
+      <w:r>
+        <w:t xml:space="preserve"> in some working folders); then save the resulting theoretical BPA objects and geometry in the test-specific MAT file.</w:t>
+      </w:r>
+    </w:p>
+    <w:p>
+      <w:pPr>
+        <w:pStyle w:val="ListParagraph"/>
+        <w:numPr>
+          <w:ilvl w:val="0"/>
+          <w:numId w:val="10"/>
+        </w:numPr>
+      </w:pPr>
+      <w:r>
+        <w:rPr>
+          <w:u w:val="single"/>
+        </w:rPr>
+        <w:t>Extensor:</w:t>
+      </w:r>
+      <w:r>
+        <w:t xml:space="preserve"> run </w:t>
+      </w:r>
+      <w:r>
+        <w:rPr>
+          <w:b/>
+          <w:bCs/>
+        </w:rPr>
+        <w:t>Opt_run_Ext.m</w:t>
+      </w:r>
+      <w:r>
+        <w:t xml:space="preserve">; accept and save </w:t>
+      </w:r>
+      <w:r>
+        <w:rPr>
+          <w:b/>
+          <w:bCs/>
+        </w:rPr>
+        <w:t>Vas_Pam_20mm_Result.mat</w:t>
+      </w:r>
+      <w:r>
+        <w:t xml:space="preserve">; run </w:t>
+      </w:r>
+      <w:r>
+        <w:rPr>
+          <w:b/>
+          <w:bCs/>
+        </w:rPr>
+        <w:t>Knee_Extensor_20mm.m</w:t>
+      </w:r>
+      <w:r>
+        <w:t>; then save the resulting theoretical BPA objects and geometry for the planned test.</w:t>
+      </w:r>
+    </w:p>
+    <w:p>
+      <w:pPr>
+        <w:pStyle w:val="ListParagraph"/>
+        <w:numPr>
+          <w:ilvl w:val="0"/>
+          <w:numId w:val="10"/>
+        </w:numPr>
+      </w:pPr>
+      <w:r>
+        <w:t>Perform the physical experiment and add the measured knee angle, torque, pressure, inflated length, and moment-arm data to the test-specific result file.</w:t>
+      </w:r>
+    </w:p>
+    <w:p>
+      <w:pPr>
+        <w:pStyle w:val="ListParagraph"/>
+        <w:numPr>
+          <w:ilvl w:val="0"/>
+          <w:numId w:val="10"/>
+        </w:numPr>
+      </w:pPr>
+      <w:r>
+        <w:t xml:space="preserve">Run a comparison script such as </w:t>
+      </w:r>
+      <w:r>
+        <w:rPr>
+          <w:b/>
+          <w:bCs/>
+        </w:rPr>
+        <w:t>Plot_KneeFlx_20mm_42cm.m</w:t>
+      </w:r>
+      <w:r>
+        <w:t>. These plotting scripts combine the saved class predictions, experimental measurements, hybrid force-times-moment-arm calculations, and OpenSim reference data; they do not rerun the route optimizer.</w:t>
+      </w:r>
+    </w:p>
+    <w:p>
+      <w:pPr>
+        <w:pStyle w:val="ListParagraph"/>
+      </w:pPr>
+    </w:p>
+    <w:p>
+      <w:pPr>
+        <w:pStyle w:val="Heading3"/>
+      </w:pPr>
+      <w:r>
+        <w:t>Relationship to the Xi0-Xi3 minimizers</w:t>
+      </w:r>
+    </w:p>
+    <w:p>
+      <w:pPr>
+        <w:pStyle w:val="ListParagraph"/>
+      </w:pPr>
+      <w:r>
+        <w:rPr>
+          <w:b/>
+          <w:bCs/>
+        </w:rPr>
+        <w:t>minimizeFlx</w:t>
+      </w:r>
+      <w:r>
+        <w:t xml:space="preserve">, </w:t>
+      </w:r>
+      <w:r>
+        <w:rPr>
+          <w:b/>
+          <w:bCs/>
+        </w:rPr>
+        <w:t>minimizeFlxPin</w:t>
+      </w:r>
+      <w:r>
+        <w:t xml:space="preserve">, </w:t>
+      </w:r>
+      <w:r>
+        <w:rPr>
+          <w:b/>
+          <w:bCs/>
+        </w:rPr>
+        <w:t>minimizeExt</w:t>
+      </w:r>
+      <w:r>
+        <w:t xml:space="preserve">, and </w:t>
+      </w:r>
+      <w:r>
+        <w:rPr>
+          <w:b/>
+          <w:bCs/>
+        </w:rPr>
+        <w:t>minimizeExtX3</w:t>
+      </w:r>
+      <w:r>
+        <w:t xml:space="preserve"> identify or validate </w:t>
+      </w:r>
+      <w:r>
+        <w:rPr>
+          <w:i/>
+          <w:iCs/>
+        </w:rPr>
+        <w:t xml:space="preserve">Xi </w:t>
+      </w:r>
+      <w:r>
+        <w:t xml:space="preserve">stiffness/length-loss parameters against saved experimental and hybrid data. Their </w:t>
+      </w:r>
+      <w:r>
+        <w:rPr>
+          <w:i/>
+          <w:iCs/>
+        </w:rPr>
+        <w:t>kf</w:t>
+      </w:r>
+      <w:r>
+        <w:t xml:space="preserve"> and </w:t>
+      </w:r>
+      <w:r>
+        <w:rPr>
+          <w:i/>
+          <w:iCs/>
+        </w:rPr>
+        <w:t>ke</w:t>
+      </w:r>
+      <w:r>
+        <w:t xml:space="preserve"> structures are data containers whose core geometry, BPA inputs, and predicted fields </w:t>
+      </w:r>
+      <w:r>
+        <w:lastRenderedPageBreak/>
+        <w:t xml:space="preserve">correspond closely to the </w:t>
+      </w:r>
+      <w:r>
+        <w:rPr>
+          <w:b/>
+          <w:bCs/>
+        </w:rPr>
+        <w:t>MonoPamDataExplicit</w:t>
+      </w:r>
+      <w:r>
+        <w:t xml:space="preserve"> class properties. Experimental fields such as </w:t>
+      </w:r>
+      <w:r>
+        <w:rPr>
+          <w:i/>
+          <w:iCs/>
+        </w:rPr>
+        <w:t>Aexp/Mexp</w:t>
+      </w:r>
+      <w:r>
+        <w:t xml:space="preserve"> and hybrid fields such as </w:t>
+      </w:r>
+      <w:r>
+        <w:rPr>
+          <w:i/>
+          <w:iCs/>
+        </w:rPr>
+        <w:t>A_h/Lm_h/mA_h/M_h</w:t>
+      </w:r>
+      <w:r>
+        <w:t xml:space="preserve"> remain outside the class because they describe a particular test, not the BPA model itself.</w:t>
+      </w:r>
+    </w:p>
+    <w:p>
+      <w:pPr>
+        <w:pStyle w:val="ListParagraph"/>
+      </w:pPr>
+      <w:r>
+        <w:t xml:space="preserve">The bracket frame is configuration-specific. </w:t>
+      </w:r>
+      <w:r>
+        <w:rPr>
+          <w:b/>
+          <w:bCs/>
+        </w:rPr>
+        <w:t>minimizeExt</w:t>
+      </w:r>
+      <w:r>
+        <w:t xml:space="preserve">, </w:t>
+      </w:r>
+      <w:r>
+        <w:rPr>
+          <w:b/>
+          <w:bCs/>
+        </w:rPr>
+        <w:t>minimizeExtX3</w:t>
+      </w:r>
+      <w:r>
+        <w:t xml:space="preserve">, and </w:t>
+      </w:r>
+      <w:r>
+        <w:rPr>
+          <w:b/>
+          <w:bCs/>
+        </w:rPr>
+        <w:t>minimizeFlx</w:t>
+      </w:r>
+      <w:r>
+        <w:t xml:space="preserve"> update a femur/hip-side point through a bracket frame expressed relative to that body. </w:t>
+      </w:r>
+      <w:r>
+        <w:rPr>
+          <w:b/>
+          <w:bCs/>
+        </w:rPr>
+        <w:t>minimizeFlxPin</w:t>
+      </w:r>
+      <w:r>
+        <w:t xml:space="preserve"> updates a tibia/knee-side point through a tibial bracket frame. This is why bracket origin, rotation, parent body, and deformed </w:t>
+      </w:r>
+      <w:r>
+        <w:rPr>
+          <w:i/>
+          <w:iCs/>
+        </w:rPr>
+        <w:t>Location</w:t>
+      </w:r>
+      <w:r>
+        <w:t xml:space="preserve"> row must be explicit before one common stiffness routine can safely cover every experiment.</w:t>
+      </w:r>
+    </w:p>
+    <w:p>
+      <w:pPr>
+        <w:pStyle w:val="Heading3"/>
+      </w:pPr>
+      <w:r>
+        <w:t>Consolidation without creating many more files</w:t>
+      </w:r>
+    </w:p>
+    <w:p>
+      <w:pPr>
+        <w:pStyle w:val="ListParagraph"/>
+        <w:numPr>
+          <w:ilvl w:val="0"/>
+          <w:numId w:val="11"/>
+        </w:numPr>
+      </w:pPr>
+      <w:r>
+        <w:rPr>
+          <w:u w:val="single"/>
+        </w:rPr>
+        <w:t>Good consolidation candidate</w:t>
+      </w:r>
+      <w:r>
+        <w:t xml:space="preserve"> – the duplicated robot-knee transform and angle-grid setup in </w:t>
+      </w:r>
+      <w:r>
+        <w:rPr>
+          <w:b/>
+          <w:bCs/>
+        </w:rPr>
+        <w:t>buildKneeFlexorContext20mm</w:t>
+      </w:r>
+      <w:r>
+        <w:t xml:space="preserve"> and </w:t>
+      </w:r>
+      <w:r>
+        <w:rPr>
+          <w:b/>
+          <w:bCs/>
+        </w:rPr>
+        <w:t>buildKneeExtContext20mm</w:t>
+      </w:r>
+      <w:r>
+        <w:t xml:space="preserve">. Consolidate it only after a regression check confirms identical </w:t>
+      </w:r>
+      <w:r>
+        <w:rPr>
+          <w:i/>
+          <w:iCs/>
+        </w:rPr>
+        <w:t>T_Pam, T_ICR_t1, T_t1_ICR, T_t1_f, phiD,</w:t>
+      </w:r>
+      <w:r>
+        <w:t xml:space="preserve"> and </w:t>
+      </w:r>
+      <w:r>
+        <w:rPr>
+          <w:i/>
+          <w:iCs/>
+        </w:rPr>
+        <w:t xml:space="preserve">pos </w:t>
+      </w:r>
+      <w:r>
+        <w:t>outputs.</w:t>
+      </w:r>
+    </w:p>
+    <w:p>
+      <w:pPr>
+        <w:pStyle w:val="ListParagraph"/>
+        <w:numPr>
+          <w:ilvl w:val="0"/>
+          <w:numId w:val="11"/>
+        </w:numPr>
+      </w:pPr>
+      <w:r>
+        <w:rPr>
+          <w:u w:val="single"/>
+        </w:rPr>
+        <w:t>Good consolidation candidate</w:t>
+      </w:r>
+      <w:r>
+        <w:t xml:space="preserve"> – common result-field naming and plotting style. Keeping one documented prediction schema and one shared formatting utility would reduce copy/paste changes without changing the mechanics.</w:t>
+      </w:r>
+    </w:p>
+    <w:p>
+      <w:pPr>
+        <w:pStyle w:val="ListParagraph"/>
+        <w:numPr>
+          <w:ilvl w:val="0"/>
+          <w:numId w:val="11"/>
+        </w:numPr>
+      </w:pPr>
+      <w:r>
+        <w:rPr>
+          <w:u w:val="single"/>
+        </w:rPr>
+        <w:t>Keep separate</w:t>
+      </w:r>
+      <w:r>
+        <w:t xml:space="preserve"> – </w:t>
+      </w:r>
+      <w:r>
+        <w:rPr>
+          <w:b/>
+          <w:bCs/>
+        </w:rPr>
+        <w:t>buildKneeFlexorRoute20mm</w:t>
+      </w:r>
+      <w:r>
+        <w:t xml:space="preserve"> versus </w:t>
+      </w:r>
+      <w:r>
+        <w:rPr>
+          <w:b/>
+          <w:bCs/>
+        </w:rPr>
+        <w:t>buildDistalRingLocation20mm</w:t>
+      </w:r>
+      <w:r>
+        <w:t xml:space="preserve">, and </w:t>
+      </w:r>
+      <w:r>
+        <w:rPr>
+          <w:b/>
+          <w:bCs/>
+        </w:rPr>
+        <w:t>nonlconExclusion</w:t>
+      </w:r>
+      <w:r>
+        <w:t xml:space="preserve"> versus </w:t>
+      </w:r>
+      <w:r>
+        <w:rPr>
+          <w:b/>
+          <w:bCs/>
+        </w:rPr>
+        <w:t>nonlconExt20mm</w:t>
+      </w:r>
+      <w:r>
+        <w:t>. Their geometry, activation logic, and collision constraints are genuinely different.</w:t>
+      </w:r>
+    </w:p>
+    <w:p>
+      <w:pPr>
+        <w:pStyle w:val="ListParagraph"/>
+        <w:numPr>
+          <w:ilvl w:val="0"/>
+          <w:numId w:val="11"/>
+        </w:numPr>
+      </w:pPr>
+      <w:r>
+        <w:t>Do not consolidate the femur-side and tibia-side bracket calculations until the bracket parent frame, bracket transform, stiffness principal axes, and deformed route row are explicit inputs. Hiding those differences inside a generic helper would make the result harder to verify.</w:t>
+      </w:r>
+    </w:p>
+    <w:p>
+      <w:pPr>
+        <w:pStyle w:val="ListParagraph"/>
+        <w:numPr>
+          <w:ilvl w:val="0"/>
+          <w:numId w:val="11"/>
+        </w:numPr>
+      </w:pPr>
+      <w:r>
+        <w:rPr>
+          <w:u w:val="single"/>
+        </w:rPr>
+        <w:t>Recommended boundary</w:t>
+      </w:r>
+      <w:r>
+        <w:t xml:space="preserve"> – keep </w:t>
+      </w:r>
+      <w:r>
+        <w:rPr>
+          <w:b/>
+          <w:bCs/>
+        </w:rPr>
+        <w:t>Opt_run.m</w:t>
+      </w:r>
+      <w:r>
+        <w:t xml:space="preserve"> and </w:t>
+      </w:r>
+      <w:r>
+        <w:rPr>
+          <w:b/>
+          <w:bCs/>
+        </w:rPr>
+        <w:t>Opt_run_Ext.m</w:t>
+      </w:r>
+      <w:r>
+        <w:t xml:space="preserve"> as readable orchestration scripts; keep physics in the </w:t>
+      </w:r>
+      <w:proofErr w:type="spellStart"/>
+      <w:r>
+        <w:rPr>
+          <w:b/>
+          <w:bCs/>
+        </w:rPr>
+        <w:t>MonoPamDataExplicit</w:t>
+      </w:r>
+      <w:r>
+        <w:rPr>
+          <w:b/>
+          <w:bCs/>
+        </w:rPr>
+        <w:t>_</w:t>
+      </w:r>
+      <w:r>
+        <w:rPr>
+          <w:b/>
+          <w:bCs/>
+        </w:rPr>
+        <w:t>balance</w:t>
+      </w:r>
+      <w:proofErr w:type="spellEnd"/>
+      <w:r>
+        <w:t xml:space="preserve"> class; keep route and collision geometry in the side-specific builders/constraints; and add a shared helper only when it replaces a substantial duplicated block rather than adding another thin wrapper.</w:t>
+      </w:r>
+    </w:p>
+    <w:p/>
+    <w:p>
+      <w:pPr>
+        <w:pStyle w:val="Heading2"/>
+      </w:pPr>
+      <w:r>
+        <w:t>Used by Morrow et al.</w:t>
+      </w:r>
+      <w:r>
+        <w:t xml:space="preserve"> (2020)</w:t>
+      </w:r>
+    </w:p>
+    <w:p>
+      <w:proofErr w:type="spellStart"/>
+      <w:r>
+        <w:rPr>
+          <w:b/>
+          <w:bCs/>
+          <w:i/>
+          <w:iCs/>
+        </w:rPr>
+        <w:t>Muscle_Name</w:t>
+      </w:r>
+      <w:r>
+        <w:rPr>
+          <w:b/>
+          <w:bCs/>
+        </w:rPr>
+        <w:t>_Mesh_Opt.m</w:t>
+      </w:r>
+      <w:proofErr w:type="spellEnd"/>
+      <w:r>
+        <w:t xml:space="preserve"> – </w:t>
+      </w:r>
+      <w:r>
+        <w:t xml:space="preserve">These scripts use the skeletal mesh from </w:t>
+      </w:r>
+      <w:proofErr w:type="spellStart"/>
+      <w:r>
+        <w:t>OpenSim</w:t>
+      </w:r>
+      <w:proofErr w:type="spellEnd"/>
+      <w:r>
+        <w:t xml:space="preserve"> to determine the best placement for PAMs in order to replace one or more muscles. Each script follows the general structure:</w:t>
+      </w:r>
+    </w:p>
+    <w:p>
+      <w:pPr>
+        <w:pStyle w:val="ListParagraph"/>
+        <w:numPr>
+          <w:ilvl w:val="0"/>
+          <w:numId w:val="12"/>
+        </w:numPr>
+      </w:pPr>
+      <w:r>
+        <w:t xml:space="preserve">Add file paths to the human muscle class structure, robot PAM class structure, functions folder, and </w:t>
+      </w:r>
+      <w:proofErr w:type="spellStart"/>
+      <w:r>
+        <w:t>OpenSim</w:t>
+      </w:r>
+      <w:proofErr w:type="spellEnd"/>
+      <w:r>
+        <w:t xml:space="preserve"> data folder</w:t>
+      </w:r>
+    </w:p>
+    <w:p>
+      <w:pPr>
+        <w:pStyle w:val="ListParagraph"/>
+        <w:numPr>
+          <w:ilvl w:val="0"/>
+          <w:numId w:val="12"/>
+        </w:numPr>
+      </w:pPr>
+      <w:r>
+        <w:t xml:space="preserve">Creates transformation matrices for the joints that the muscles will cross over. These are made by creating a linearly spaced vector of angles between the joints minimum and maximum orientations. Those angles are then used to create a rotation matrix and then a transformation matrix by using the distance between the first point in a muscle’s reference frame and the following joint frames that the muscle crosses over into. </w:t>
+      </w:r>
+    </w:p>
+    <w:p>
+      <w:pPr>
+        <w:pStyle w:val="ListParagraph"/>
+        <w:numPr>
+          <w:ilvl w:val="0"/>
+          <w:numId w:val="12"/>
+        </w:numPr>
+      </w:pPr>
+      <w:r>
+        <w:t>Runs the class structure for the human muscles.</w:t>
+      </w:r>
+    </w:p>
+    <w:p>
+      <w:pPr>
+        <w:pStyle w:val="ListParagraph"/>
+        <w:numPr>
+          <w:ilvl w:val="0"/>
+          <w:numId w:val="12"/>
+        </w:numPr>
+      </w:pPr>
+      <w:r>
+        <w:t>Runs the class structure for the PAM based on an initial starting point. This initial starting point is typically the same as the human muscle’s locations, but may have one or more points removed to make a more linear path.</w:t>
+      </w:r>
+    </w:p>
+    <w:p>
+      <w:pPr>
+        <w:pStyle w:val="ListParagraph"/>
+        <w:numPr>
+          <w:ilvl w:val="0"/>
+          <w:numId w:val="12"/>
+        </w:numPr>
+      </w:pPr>
+      <w:r>
         <w:t>If the joint has more than one degree of freedom, the torque tensor is unstacked into multiple torque matrices that only capture information about one axis.</w:t>
       </w:r>
     </w:p>
@@ -580,10 +1678,11 @@
         <w:pStyle w:val="ListParagraph"/>
         <w:numPr>
           <w:ilvl w:val="1"/>
-          <w:numId w:val="7"/>
+          <w:numId w:val="12"/>
         </w:numPr>
       </w:pPr>
       <w:r>
+        <w:lastRenderedPageBreak/>
         <w:t>If the PAM is replacing a group of muscles, those human muscles have their torques added together for comparison later against the PAM torque.</w:t>
       </w:r>
     </w:p>
@@ -592,7 +1691,7 @@
         <w:pStyle w:val="ListParagraph"/>
         <w:numPr>
           <w:ilvl w:val="0"/>
-          <w:numId w:val="7"/>
+          <w:numId w:val="12"/>
         </w:numPr>
       </w:pPr>
       <w:r>
@@ -604,7 +1703,7 @@
         <w:pStyle w:val="ListParagraph"/>
         <w:numPr>
           <w:ilvl w:val="0"/>
-          <w:numId w:val="7"/>
+          <w:numId w:val="12"/>
         </w:numPr>
       </w:pPr>
       <w:r>
@@ -616,7 +1715,7 @@
         <w:pStyle w:val="ListParagraph"/>
         <w:numPr>
           <w:ilvl w:val="0"/>
-          <w:numId w:val="7"/>
+          <w:numId w:val="12"/>
         </w:numPr>
       </w:pPr>
       <w:r>
@@ -634,15 +1733,20 @@
     <w:p/>
     <w:p>
       <w:r>
-        <w:t xml:space="preserve">The intention was for these scripts to serve as a starting point, for both the optimization code and for generating decent locations for physical PAM attachments. This code can be improved by adding onto it a more traditional machine learning algorithm, in which after the best location is found from the mesh </w:t>
-      </w:r>
-      <w:r>
-        <w:lastRenderedPageBreak/>
-        <w:t>data points, that would serve as a starting point to do a first order gradient descent search around that point. The implementation of this is in “Bifemsh_Mesh_Refine_Opt.m”.</w:t>
+        <w:t>The intention was for these scripts to serve as a starting point, for both the optimization code and for generating decent locations for physical PAM attachments. This code can be improved by adding onto it a more traditional machine learning algorithm, in which after the best location is found from the mesh data points, that would serve as a starting point to do a first order gradient descent search around that point. The implementation of this is in “</w:t>
+      </w:r>
+      <w:proofErr w:type="spellStart"/>
+      <w:r>
+        <w:t>Bifemsh_Mesh_Refine_Opt.m</w:t>
+      </w:r>
+      <w:proofErr w:type="spellEnd"/>
+      <w:r>
+        <w:t>”.</w:t>
       </w:r>
     </w:p>
     <w:p/>
     <w:p>
+      <w:proofErr w:type="spellStart"/>
       <w:r>
         <w:rPr>
           <w:b/>
@@ -657,6 +1761,7 @@
         </w:rPr>
         <w:t>.m</w:t>
       </w:r>
+      <w:proofErr w:type="spellEnd"/>
       <w:r>
         <w:rPr>
           <w:b/>
@@ -668,11 +1773,20 @@
         <w:t>– T</w:t>
       </w:r>
       <w:r>
-        <w:t xml:space="preserve">his script is an example extension of the Mesh_Opt code that was discussed previously. It contains all of the previous code, but adds a component that uses a machine learning algorithm to search the space around the best attachment location based on the skeletal data points. The algorithm looks at 8 points around the muscle locations before and after a point and calculates the cost function between all 64 connections using those points. Once a new minimum is found between all of those points, it uses the minimum cost locations to repeat the process. It outputs the same form of results as the previous code. </w:t>
+        <w:t xml:space="preserve">his script is an example extension of the </w:t>
+      </w:r>
+      <w:proofErr w:type="spellStart"/>
+      <w:r>
+        <w:t>Mesh_Opt</w:t>
+      </w:r>
+      <w:proofErr w:type="spellEnd"/>
+      <w:r>
+        <w:t xml:space="preserve"> code that was discussed previously. It contains all of the previous code, but adds a component that uses a machine learning algorithm to search the space around the best attachment location based on the skeletal data points. The algorithm looks at 8 points around the muscle locations before and after a point and calculates the cost function between all 64 connections using those points. Once a new minimum is found between all of those points, it uses the minimum cost locations to repeat the process. It outputs the same form of results as the previous code. </w:t>
       </w:r>
     </w:p>
     <w:p/>
     <w:p>
+      <w:proofErr w:type="spellStart"/>
       <w:r>
         <w:rPr>
           <w:b/>
@@ -680,6 +1794,7 @@
         </w:rPr>
         <w:t>costFunctionKnee.m</w:t>
       </w:r>
+      <w:proofErr w:type="spellEnd"/>
       <w:r>
         <w:t xml:space="preserve"> – This cost function is an adjustment from the generic one found in the “Functions” folder. Because the knee only actuates in one direction, this cost function more heavily weights the torque and torque angle around the z direction of the knee, and reduces the value of those parameters in the other directions. </w:t>
       </w:r>
@@ -719,6 +1834,92 @@
 <file path=word/numbering.xml><?xml version="1.0" encoding="utf-8"?>
 <w:numbering xmlns:wpc="http://schemas.microsoft.com/office/word/2010/wordprocessingCanvas" xmlns:cx="http://schemas.microsoft.com/office/drawing/2014/chartex" xmlns:cx1="http://schemas.microsoft.com/office/drawing/2015/9/8/chartex" xmlns:cx2="http://schemas.microsoft.com/office/drawing/2015/10/21/chartex" xmlns:cx3="http://schemas.microsoft.com/office/drawing/2016/5/9/chartex" xmlns:cx4="http://schemas.microsoft.com/office/drawing/2016/5/10/chartex" xmlns:cx5="http://schemas.microsoft.com/office/drawing/2016/5/11/chartex" xmlns:cx6="http://schemas.microsoft.com/office/drawing/2016/5/12/chartex" xmlns:cx7="http://schemas.microsoft.com/office/drawing/2016/5/13/chartex" xmlns:cx8="http://schemas.microsoft.com/office/drawing/2016/5/14/chartex" xmlns:mc="http://schemas.openxmlformats.org/markup-compatibility/2006" xmlns:aink="http://schemas.microsoft.com/office/drawing/2016/ink" xmlns:am3d="http://schemas.microsoft.com/office/drawing/2017/model3d" xmlns:o="urn:schemas-microsoft-com:office:office" xmlns:oel="http://schemas.microsoft.com/office/2019/extlst" xmlns:r="http://schemas.openxmlformats.org/officeDocument/2006/relationships" xmlns:m="http://schemas.openxmlformats.org/officeDocument/2006/math" xmlns:v="urn:schemas-microsoft-com:vml" xmlns:wp14="http://schemas.microsoft.com/office/word/2010/wordprocessingDrawing" xmlns:wp="http://schemas.openxmlformats.org/drawingml/2006/wordprocessingDrawing" xmlns:w10="urn:schemas-microsoft-com:office:word" xmlns:w="http://schemas.openxmlformats.org/wordprocessingml/2006/main" xmlns:w14="http://schemas.microsoft.com/office/word/2010/wordml" xmlns:w15="http://schemas.microsoft.com/office/word/2012/wordml" xmlns:w16cex="http://schemas.microsoft.com/office/word/2018/wordml/cex" xmlns:w16cid="http://schemas.microsoft.com/office/word/2016/wordml/cid" xmlns:w16="http://schemas.microsoft.com/office/word/2018/wordml" xmlns:w16du="http://schemas.microsoft.com/office/word/2023/wordml/word16du" xmlns:w16sdtdh="http://schemas.microsoft.com/office/word/2020/wordml/sdtdatahash" xmlns:w16sdtfl="http://schemas.microsoft.com/office/word/2024/wordml/sdtformatlock" xmlns:w16se="http://schemas.microsoft.com/office/word/2015/wordml/symex" xmlns:wpg="http://schemas.microsoft.com/office/word/2010/wordprocessingGroup" xmlns:wpi="http://schemas.microsoft.com/office/word/2010/wordprocessingInk" xmlns:wne="http://schemas.microsoft.com/office/word/2006/wordml" xmlns:wps="http://schemas.microsoft.com/office/word/2010/wordprocessingShape" mc:Ignorable="w14 w15 w16se w16cid w16 w16cex w16sdtdh w16sdtfl w16du wp14">
   <w:abstractNum w:abstractNumId="0" w15:restartNumberingAfterBreak="0">
+    <w:nsid w:val="058205F0"/>
+    <w:multiLevelType w:val="hybridMultilevel"/>
+    <w:tmpl w:val="E4C6138C"/>
+    <w:lvl w:ilvl="0" w:tplc="0409000F">
+      <w:start w:val="1"/>
+      <w:numFmt w:val="decimal"/>
+      <w:lvlText w:val="%1."/>
+      <w:lvlJc w:val="left"/>
+      <w:pPr>
+        <w:ind w:left="765" w:hanging="360"/>
+      </w:pPr>
+    </w:lvl>
+    <w:lvl w:ilvl="1" w:tplc="04090019">
+      <w:start w:val="1"/>
+      <w:numFmt w:val="lowerLetter"/>
+      <w:lvlText w:val="%2."/>
+      <w:lvlJc w:val="left"/>
+      <w:pPr>
+        <w:ind w:left="1485" w:hanging="360"/>
+      </w:pPr>
+    </w:lvl>
+    <w:lvl w:ilvl="2" w:tplc="0409001B" w:tentative="1">
+      <w:start w:val="1"/>
+      <w:numFmt w:val="lowerRoman"/>
+      <w:lvlText w:val="%3."/>
+      <w:lvlJc w:val="right"/>
+      <w:pPr>
+        <w:ind w:left="2205" w:hanging="180"/>
+      </w:pPr>
+    </w:lvl>
+    <w:lvl w:ilvl="3" w:tplc="0409000F" w:tentative="1">
+      <w:start w:val="1"/>
+      <w:numFmt w:val="decimal"/>
+      <w:lvlText w:val="%4."/>
+      <w:lvlJc w:val="left"/>
+      <w:pPr>
+        <w:ind w:left="2925" w:hanging="360"/>
+      </w:pPr>
+    </w:lvl>
+    <w:lvl w:ilvl="4" w:tplc="04090019" w:tentative="1">
+      <w:start w:val="1"/>
+      <w:numFmt w:val="lowerLetter"/>
+      <w:lvlText w:val="%5."/>
+      <w:lvlJc w:val="left"/>
+      <w:pPr>
+        <w:ind w:left="3645" w:hanging="360"/>
+      </w:pPr>
+    </w:lvl>
+    <w:lvl w:ilvl="5" w:tplc="0409001B" w:tentative="1">
+      <w:start w:val="1"/>
+      <w:numFmt w:val="lowerRoman"/>
+      <w:lvlText w:val="%6."/>
+      <w:lvlJc w:val="right"/>
+      <w:pPr>
+        <w:ind w:left="4365" w:hanging="180"/>
+      </w:pPr>
+    </w:lvl>
+    <w:lvl w:ilvl="6" w:tplc="0409000F" w:tentative="1">
+      <w:start w:val="1"/>
+      <w:numFmt w:val="decimal"/>
+      <w:lvlText w:val="%7."/>
+      <w:lvlJc w:val="left"/>
+      <w:pPr>
+        <w:ind w:left="5085" w:hanging="360"/>
+      </w:pPr>
+    </w:lvl>
+    <w:lvl w:ilvl="7" w:tplc="04090019" w:tentative="1">
+      <w:start w:val="1"/>
+      <w:numFmt w:val="lowerLetter"/>
+      <w:lvlText w:val="%8."/>
+      <w:lvlJc w:val="left"/>
+      <w:pPr>
+        <w:ind w:left="5805" w:hanging="360"/>
+      </w:pPr>
+    </w:lvl>
+    <w:lvl w:ilvl="8" w:tplc="0409001B" w:tentative="1">
+      <w:start w:val="1"/>
+      <w:numFmt w:val="lowerRoman"/>
+      <w:lvlText w:val="%9."/>
+      <w:lvlJc w:val="right"/>
+      <w:pPr>
+        <w:ind w:left="6525" w:hanging="180"/>
+      </w:pPr>
+    </w:lvl>
+  </w:abstractNum>
+  <w:abstractNum w:abstractNumId="1" w15:restartNumberingAfterBreak="0">
     <w:nsid w:val="0E050DA6"/>
     <w:multiLevelType w:val="hybridMultilevel"/>
     <w:tmpl w:val="228494B6"/>
@@ -831,7 +2032,7 @@
       </w:rPr>
     </w:lvl>
   </w:abstractNum>
-  <w:abstractNum w:abstractNumId="1" w15:restartNumberingAfterBreak="0">
+  <w:abstractNum w:abstractNumId="2" w15:restartNumberingAfterBreak="0">
     <w:nsid w:val="16237D78"/>
     <w:multiLevelType w:val="hybridMultilevel"/>
     <w:tmpl w:val="AFAE302A"/>
@@ -944,7 +2145,7 @@
       </w:rPr>
     </w:lvl>
   </w:abstractNum>
-  <w:abstractNum w:abstractNumId="2" w15:restartNumberingAfterBreak="0">
+  <w:abstractNum w:abstractNumId="3" w15:restartNumberingAfterBreak="0">
     <w:nsid w:val="28573F3A"/>
     <w:multiLevelType w:val="hybridMultilevel"/>
     <w:tmpl w:val="CCD25026"/>
@@ -1030,7 +2231,351 @@
       </w:pPr>
     </w:lvl>
   </w:abstractNum>
-  <w:abstractNum w:abstractNumId="3" w15:restartNumberingAfterBreak="0">
+  <w:abstractNum w:abstractNumId="4" w15:restartNumberingAfterBreak="0">
+    <w:nsid w:val="39DC5DE9"/>
+    <w:multiLevelType w:val="hybridMultilevel"/>
+    <w:tmpl w:val="99C6C3B2"/>
+    <w:lvl w:ilvl="0" w:tplc="0409000F">
+      <w:start w:val="1"/>
+      <w:numFmt w:val="decimal"/>
+      <w:lvlText w:val="%1."/>
+      <w:lvlJc w:val="left"/>
+      <w:pPr>
+        <w:ind w:left="765" w:hanging="360"/>
+      </w:pPr>
+    </w:lvl>
+    <w:lvl w:ilvl="1" w:tplc="FFFFFFFF">
+      <w:start w:val="1"/>
+      <w:numFmt w:val="lowerLetter"/>
+      <w:lvlText w:val="%2."/>
+      <w:lvlJc w:val="left"/>
+      <w:pPr>
+        <w:ind w:left="1485" w:hanging="360"/>
+      </w:pPr>
+    </w:lvl>
+    <w:lvl w:ilvl="2" w:tplc="FFFFFFFF" w:tentative="1">
+      <w:start w:val="1"/>
+      <w:numFmt w:val="lowerRoman"/>
+      <w:lvlText w:val="%3."/>
+      <w:lvlJc w:val="right"/>
+      <w:pPr>
+        <w:ind w:left="2205" w:hanging="180"/>
+      </w:pPr>
+    </w:lvl>
+    <w:lvl w:ilvl="3" w:tplc="FFFFFFFF" w:tentative="1">
+      <w:start w:val="1"/>
+      <w:numFmt w:val="decimal"/>
+      <w:lvlText w:val="%4."/>
+      <w:lvlJc w:val="left"/>
+      <w:pPr>
+        <w:ind w:left="2925" w:hanging="360"/>
+      </w:pPr>
+    </w:lvl>
+    <w:lvl w:ilvl="4" w:tplc="FFFFFFFF" w:tentative="1">
+      <w:start w:val="1"/>
+      <w:numFmt w:val="lowerLetter"/>
+      <w:lvlText w:val="%5."/>
+      <w:lvlJc w:val="left"/>
+      <w:pPr>
+        <w:ind w:left="3645" w:hanging="360"/>
+      </w:pPr>
+    </w:lvl>
+    <w:lvl w:ilvl="5" w:tplc="FFFFFFFF" w:tentative="1">
+      <w:start w:val="1"/>
+      <w:numFmt w:val="lowerRoman"/>
+      <w:lvlText w:val="%6."/>
+      <w:lvlJc w:val="right"/>
+      <w:pPr>
+        <w:ind w:left="4365" w:hanging="180"/>
+      </w:pPr>
+    </w:lvl>
+    <w:lvl w:ilvl="6" w:tplc="FFFFFFFF" w:tentative="1">
+      <w:start w:val="1"/>
+      <w:numFmt w:val="decimal"/>
+      <w:lvlText w:val="%7."/>
+      <w:lvlJc w:val="left"/>
+      <w:pPr>
+        <w:ind w:left="5085" w:hanging="360"/>
+      </w:pPr>
+    </w:lvl>
+    <w:lvl w:ilvl="7" w:tplc="FFFFFFFF" w:tentative="1">
+      <w:start w:val="1"/>
+      <w:numFmt w:val="lowerLetter"/>
+      <w:lvlText w:val="%8."/>
+      <w:lvlJc w:val="left"/>
+      <w:pPr>
+        <w:ind w:left="5805" w:hanging="360"/>
+      </w:pPr>
+    </w:lvl>
+    <w:lvl w:ilvl="8" w:tplc="FFFFFFFF" w:tentative="1">
+      <w:start w:val="1"/>
+      <w:numFmt w:val="lowerRoman"/>
+      <w:lvlText w:val="%9."/>
+      <w:lvlJc w:val="right"/>
+      <w:pPr>
+        <w:ind w:left="6525" w:hanging="180"/>
+      </w:pPr>
+    </w:lvl>
+  </w:abstractNum>
+  <w:abstractNum w:abstractNumId="5" w15:restartNumberingAfterBreak="0">
+    <w:nsid w:val="3C635545"/>
+    <w:multiLevelType w:val="hybridMultilevel"/>
+    <w:tmpl w:val="EFC61534"/>
+    <w:lvl w:ilvl="0" w:tplc="0409000F">
+      <w:start w:val="1"/>
+      <w:numFmt w:val="decimal"/>
+      <w:lvlText w:val="%1."/>
+      <w:lvlJc w:val="left"/>
+      <w:pPr>
+        <w:ind w:left="720" w:hanging="360"/>
+      </w:pPr>
+    </w:lvl>
+    <w:lvl w:ilvl="1" w:tplc="04090019" w:tentative="1">
+      <w:start w:val="1"/>
+      <w:numFmt w:val="lowerLetter"/>
+      <w:lvlText w:val="%2."/>
+      <w:lvlJc w:val="left"/>
+      <w:pPr>
+        <w:ind w:left="1440" w:hanging="360"/>
+      </w:pPr>
+    </w:lvl>
+    <w:lvl w:ilvl="2" w:tplc="0409001B" w:tentative="1">
+      <w:start w:val="1"/>
+      <w:numFmt w:val="lowerRoman"/>
+      <w:lvlText w:val="%3."/>
+      <w:lvlJc w:val="right"/>
+      <w:pPr>
+        <w:ind w:left="2160" w:hanging="180"/>
+      </w:pPr>
+    </w:lvl>
+    <w:lvl w:ilvl="3" w:tplc="0409000F" w:tentative="1">
+      <w:start w:val="1"/>
+      <w:numFmt w:val="decimal"/>
+      <w:lvlText w:val="%4."/>
+      <w:lvlJc w:val="left"/>
+      <w:pPr>
+        <w:ind w:left="2880" w:hanging="360"/>
+      </w:pPr>
+    </w:lvl>
+    <w:lvl w:ilvl="4" w:tplc="04090019" w:tentative="1">
+      <w:start w:val="1"/>
+      <w:numFmt w:val="lowerLetter"/>
+      <w:lvlText w:val="%5."/>
+      <w:lvlJc w:val="left"/>
+      <w:pPr>
+        <w:ind w:left="3600" w:hanging="360"/>
+      </w:pPr>
+    </w:lvl>
+    <w:lvl w:ilvl="5" w:tplc="0409001B" w:tentative="1">
+      <w:start w:val="1"/>
+      <w:numFmt w:val="lowerRoman"/>
+      <w:lvlText w:val="%6."/>
+      <w:lvlJc w:val="right"/>
+      <w:pPr>
+        <w:ind w:left="4320" w:hanging="180"/>
+      </w:pPr>
+    </w:lvl>
+    <w:lvl w:ilvl="6" w:tplc="0409000F" w:tentative="1">
+      <w:start w:val="1"/>
+      <w:numFmt w:val="decimal"/>
+      <w:lvlText w:val="%7."/>
+      <w:lvlJc w:val="left"/>
+      <w:pPr>
+        <w:ind w:left="5040" w:hanging="360"/>
+      </w:pPr>
+    </w:lvl>
+    <w:lvl w:ilvl="7" w:tplc="04090019" w:tentative="1">
+      <w:start w:val="1"/>
+      <w:numFmt w:val="lowerLetter"/>
+      <w:lvlText w:val="%8."/>
+      <w:lvlJc w:val="left"/>
+      <w:pPr>
+        <w:ind w:left="5760" w:hanging="360"/>
+      </w:pPr>
+    </w:lvl>
+    <w:lvl w:ilvl="8" w:tplc="0409001B" w:tentative="1">
+      <w:start w:val="1"/>
+      <w:numFmt w:val="lowerRoman"/>
+      <w:lvlText w:val="%9."/>
+      <w:lvlJc w:val="right"/>
+      <w:pPr>
+        <w:ind w:left="6480" w:hanging="180"/>
+      </w:pPr>
+    </w:lvl>
+  </w:abstractNum>
+  <w:abstractNum w:abstractNumId="6" w15:restartNumberingAfterBreak="0">
+    <w:nsid w:val="40EC599C"/>
+    <w:multiLevelType w:val="hybridMultilevel"/>
+    <w:tmpl w:val="DC1807E8"/>
+    <w:lvl w:ilvl="0" w:tplc="04090019">
+      <w:start w:val="1"/>
+      <w:numFmt w:val="lowerLetter"/>
+      <w:lvlText w:val="%1."/>
+      <w:lvlJc w:val="left"/>
+      <w:pPr>
+        <w:ind w:left="1080" w:hanging="360"/>
+      </w:pPr>
+    </w:lvl>
+    <w:lvl w:ilvl="1" w:tplc="04090019" w:tentative="1">
+      <w:start w:val="1"/>
+      <w:numFmt w:val="lowerLetter"/>
+      <w:lvlText w:val="%2."/>
+      <w:lvlJc w:val="left"/>
+      <w:pPr>
+        <w:ind w:left="1800" w:hanging="360"/>
+      </w:pPr>
+    </w:lvl>
+    <w:lvl w:ilvl="2" w:tplc="0409001B" w:tentative="1">
+      <w:start w:val="1"/>
+      <w:numFmt w:val="lowerRoman"/>
+      <w:lvlText w:val="%3."/>
+      <w:lvlJc w:val="right"/>
+      <w:pPr>
+        <w:ind w:left="2520" w:hanging="180"/>
+      </w:pPr>
+    </w:lvl>
+    <w:lvl w:ilvl="3" w:tplc="0409000F" w:tentative="1">
+      <w:start w:val="1"/>
+      <w:numFmt w:val="decimal"/>
+      <w:lvlText w:val="%4."/>
+      <w:lvlJc w:val="left"/>
+      <w:pPr>
+        <w:ind w:left="3240" w:hanging="360"/>
+      </w:pPr>
+    </w:lvl>
+    <w:lvl w:ilvl="4" w:tplc="04090019" w:tentative="1">
+      <w:start w:val="1"/>
+      <w:numFmt w:val="lowerLetter"/>
+      <w:lvlText w:val="%5."/>
+      <w:lvlJc w:val="left"/>
+      <w:pPr>
+        <w:ind w:left="3960" w:hanging="360"/>
+      </w:pPr>
+    </w:lvl>
+    <w:lvl w:ilvl="5" w:tplc="0409001B" w:tentative="1">
+      <w:start w:val="1"/>
+      <w:numFmt w:val="lowerRoman"/>
+      <w:lvlText w:val="%6."/>
+      <w:lvlJc w:val="right"/>
+      <w:pPr>
+        <w:ind w:left="4680" w:hanging="180"/>
+      </w:pPr>
+    </w:lvl>
+    <w:lvl w:ilvl="6" w:tplc="0409000F" w:tentative="1">
+      <w:start w:val="1"/>
+      <w:numFmt w:val="decimal"/>
+      <w:lvlText w:val="%7."/>
+      <w:lvlJc w:val="left"/>
+      <w:pPr>
+        <w:ind w:left="5400" w:hanging="360"/>
+      </w:pPr>
+    </w:lvl>
+    <w:lvl w:ilvl="7" w:tplc="04090019" w:tentative="1">
+      <w:start w:val="1"/>
+      <w:numFmt w:val="lowerLetter"/>
+      <w:lvlText w:val="%8."/>
+      <w:lvlJc w:val="left"/>
+      <w:pPr>
+        <w:ind w:left="6120" w:hanging="360"/>
+      </w:pPr>
+    </w:lvl>
+    <w:lvl w:ilvl="8" w:tplc="0409001B" w:tentative="1">
+      <w:start w:val="1"/>
+      <w:numFmt w:val="lowerRoman"/>
+      <w:lvlText w:val="%9."/>
+      <w:lvlJc w:val="right"/>
+      <w:pPr>
+        <w:ind w:left="6840" w:hanging="180"/>
+      </w:pPr>
+    </w:lvl>
+  </w:abstractNum>
+  <w:abstractNum w:abstractNumId="7" w15:restartNumberingAfterBreak="0">
+    <w:nsid w:val="46B42348"/>
+    <w:multiLevelType w:val="hybridMultilevel"/>
+    <w:tmpl w:val="7FAC84A2"/>
+    <w:lvl w:ilvl="0" w:tplc="0409000F">
+      <w:start w:val="1"/>
+      <w:numFmt w:val="decimal"/>
+      <w:lvlText w:val="%1."/>
+      <w:lvlJc w:val="left"/>
+      <w:pPr>
+        <w:ind w:left="720" w:hanging="360"/>
+      </w:pPr>
+    </w:lvl>
+    <w:lvl w:ilvl="1" w:tplc="04090019">
+      <w:start w:val="1"/>
+      <w:numFmt w:val="lowerLetter"/>
+      <w:lvlText w:val="%2."/>
+      <w:lvlJc w:val="left"/>
+      <w:pPr>
+        <w:ind w:left="1440" w:hanging="360"/>
+      </w:pPr>
+    </w:lvl>
+    <w:lvl w:ilvl="2" w:tplc="0409001B" w:tentative="1">
+      <w:start w:val="1"/>
+      <w:numFmt w:val="lowerRoman"/>
+      <w:lvlText w:val="%3."/>
+      <w:lvlJc w:val="right"/>
+      <w:pPr>
+        <w:ind w:left="2160" w:hanging="180"/>
+      </w:pPr>
+    </w:lvl>
+    <w:lvl w:ilvl="3" w:tplc="0409000F" w:tentative="1">
+      <w:start w:val="1"/>
+      <w:numFmt w:val="decimal"/>
+      <w:lvlText w:val="%4."/>
+      <w:lvlJc w:val="left"/>
+      <w:pPr>
+        <w:ind w:left="2880" w:hanging="360"/>
+      </w:pPr>
+    </w:lvl>
+    <w:lvl w:ilvl="4" w:tplc="04090019" w:tentative="1">
+      <w:start w:val="1"/>
+      <w:numFmt w:val="lowerLetter"/>
+      <w:lvlText w:val="%5."/>
+      <w:lvlJc w:val="left"/>
+      <w:pPr>
+        <w:ind w:left="3600" w:hanging="360"/>
+      </w:pPr>
+    </w:lvl>
+    <w:lvl w:ilvl="5" w:tplc="0409001B" w:tentative="1">
+      <w:start w:val="1"/>
+      <w:numFmt w:val="lowerRoman"/>
+      <w:lvlText w:val="%6."/>
+      <w:lvlJc w:val="right"/>
+      <w:pPr>
+        <w:ind w:left="4320" w:hanging="180"/>
+      </w:pPr>
+    </w:lvl>
+    <w:lvl w:ilvl="6" w:tplc="0409000F" w:tentative="1">
+      <w:start w:val="1"/>
+      <w:numFmt w:val="decimal"/>
+      <w:lvlText w:val="%7."/>
+      <w:lvlJc w:val="left"/>
+      <w:pPr>
+        <w:ind w:left="5040" w:hanging="360"/>
+      </w:pPr>
+    </w:lvl>
+    <w:lvl w:ilvl="7" w:tplc="04090019" w:tentative="1">
+      <w:start w:val="1"/>
+      <w:numFmt w:val="lowerLetter"/>
+      <w:lvlText w:val="%8."/>
+      <w:lvlJc w:val="left"/>
+      <w:pPr>
+        <w:ind w:left="5760" w:hanging="360"/>
+      </w:pPr>
+    </w:lvl>
+    <w:lvl w:ilvl="8" w:tplc="0409001B" w:tentative="1">
+      <w:start w:val="1"/>
+      <w:numFmt w:val="lowerRoman"/>
+      <w:lvlText w:val="%9."/>
+      <w:lvlJc w:val="right"/>
+      <w:pPr>
+        <w:ind w:left="6480" w:hanging="180"/>
+      </w:pPr>
+    </w:lvl>
+  </w:abstractNum>
+  <w:abstractNum w:abstractNumId="8" w15:restartNumberingAfterBreak="0">
     <w:nsid w:val="4C1B695A"/>
     <w:multiLevelType w:val="hybridMultilevel"/>
     <w:tmpl w:val="81C6F984"/>
@@ -1143,7 +2688,7 @@
       </w:rPr>
     </w:lvl>
   </w:abstractNum>
-  <w:abstractNum w:abstractNumId="4" w15:restartNumberingAfterBreak="0">
+  <w:abstractNum w:abstractNumId="9" w15:restartNumberingAfterBreak="0">
     <w:nsid w:val="70106CDF"/>
     <w:multiLevelType w:val="hybridMultilevel"/>
     <w:tmpl w:val="D74C27F0"/>
@@ -1256,7 +2801,7 @@
       </w:rPr>
     </w:lvl>
   </w:abstractNum>
-  <w:abstractNum w:abstractNumId="5" w15:restartNumberingAfterBreak="0">
+  <w:abstractNum w:abstractNumId="10" w15:restartNumberingAfterBreak="0">
     <w:nsid w:val="70F66105"/>
     <w:multiLevelType w:val="hybridMultilevel"/>
     <w:tmpl w:val="81CC02D2"/>
@@ -1369,7 +2914,7 @@
       </w:rPr>
     </w:lvl>
   </w:abstractNum>
-  <w:abstractNum w:abstractNumId="6" w15:restartNumberingAfterBreak="0">
+  <w:abstractNum w:abstractNumId="11" w15:restartNumberingAfterBreak="0">
     <w:nsid w:val="722A04AB"/>
     <w:multiLevelType w:val="hybridMultilevel"/>
     <w:tmpl w:val="8E74746E"/>
@@ -1483,25 +3028,40 @@
     </w:lvl>
   </w:abstractNum>
   <w:num w:numId="1" w16cid:durableId="1966428803">
+    <w:abstractNumId w:val="9"/>
+  </w:num>
+  <w:num w:numId="2" w16cid:durableId="697581207">
+    <w:abstractNumId w:val="8"/>
+  </w:num>
+  <w:num w:numId="3" w16cid:durableId="1859417956">
+    <w:abstractNumId w:val="11"/>
+  </w:num>
+  <w:num w:numId="4" w16cid:durableId="918058948">
+    <w:abstractNumId w:val="1"/>
+  </w:num>
+  <w:num w:numId="5" w16cid:durableId="2043550923">
+    <w:abstractNumId w:val="10"/>
+  </w:num>
+  <w:num w:numId="6" w16cid:durableId="43601832">
+    <w:abstractNumId w:val="2"/>
+  </w:num>
+  <w:num w:numId="7" w16cid:durableId="878784240">
+    <w:abstractNumId w:val="3"/>
+  </w:num>
+  <w:num w:numId="8" w16cid:durableId="2145156536">
+    <w:abstractNumId w:val="7"/>
+  </w:num>
+  <w:num w:numId="9" w16cid:durableId="1598060109">
+    <w:abstractNumId w:val="6"/>
+  </w:num>
+  <w:num w:numId="10" w16cid:durableId="196358999">
+    <w:abstractNumId w:val="5"/>
+  </w:num>
+  <w:num w:numId="11" w16cid:durableId="1875001646">
     <w:abstractNumId w:val="4"/>
   </w:num>
-  <w:num w:numId="2" w16cid:durableId="697581207">
-    <w:abstractNumId w:val="3"/>
-  </w:num>
-  <w:num w:numId="3" w16cid:durableId="1859417956">
-    <w:abstractNumId w:val="6"/>
-  </w:num>
-  <w:num w:numId="4" w16cid:durableId="918058948">
+  <w:num w:numId="12" w16cid:durableId="2116367720">
     <w:abstractNumId w:val="0"/>
-  </w:num>
-  <w:num w:numId="5" w16cid:durableId="2043550923">
-    <w:abstractNumId w:val="5"/>
-  </w:num>
-  <w:num w:numId="6" w16cid:durableId="43601832">
-    <w:abstractNumId w:val="1"/>
-  </w:num>
-  <w:num w:numId="7" w16cid:durableId="878784240">
-    <w:abstractNumId w:val="2"/>
   </w:num>
 </w:numbering>
 </file>
@@ -1905,9 +3465,75 @@
     <w:name w:val="Normal"/>
     <w:qFormat/>
   </w:style>
+  <w:style w:type="paragraph" w:styleId="Heading1">
+    <w:name w:val="heading 1"/>
+    <w:basedOn w:val="Normal"/>
+    <w:next w:val="Normal"/>
+    <w:link w:val="Heading1Char"/>
+    <w:uiPriority w:val="9"/>
+    <w:qFormat/>
+    <w:rsid w:val="001C1452"/>
+    <w:pPr>
+      <w:keepNext/>
+      <w:keepLines/>
+      <w:spacing w:before="240" w:after="0"/>
+      <w:outlineLvl w:val="0"/>
+    </w:pPr>
+    <w:rPr>
+      <w:rFonts w:asciiTheme="majorHAnsi" w:eastAsiaTheme="majorEastAsia" w:hAnsiTheme="majorHAnsi" w:cstheme="majorBidi"/>
+      <w:color w:val="2F5496" w:themeColor="accent1" w:themeShade="BF"/>
+      <w:sz w:val="32"/>
+      <w:szCs w:val="32"/>
+    </w:rPr>
+  </w:style>
+  <w:style w:type="paragraph" w:styleId="Heading2">
+    <w:name w:val="heading 2"/>
+    <w:basedOn w:val="Normal"/>
+    <w:next w:val="Normal"/>
+    <w:link w:val="Heading2Char"/>
+    <w:uiPriority w:val="9"/>
+    <w:unhideWhenUsed/>
+    <w:qFormat/>
+    <w:rsid w:val="001C1452"/>
+    <w:pPr>
+      <w:keepNext/>
+      <w:keepLines/>
+      <w:spacing w:before="40" w:after="0"/>
+      <w:outlineLvl w:val="1"/>
+    </w:pPr>
+    <w:rPr>
+      <w:rFonts w:asciiTheme="majorHAnsi" w:eastAsiaTheme="majorEastAsia" w:hAnsiTheme="majorHAnsi" w:cstheme="majorBidi"/>
+      <w:color w:val="2F5496" w:themeColor="accent1" w:themeShade="BF"/>
+      <w:sz w:val="26"/>
+      <w:szCs w:val="26"/>
+    </w:rPr>
+  </w:style>
+  <w:style w:type="paragraph" w:styleId="Heading3">
+    <w:name w:val="heading 3"/>
+    <w:basedOn w:val="Normal"/>
+    <w:next w:val="Normal"/>
+    <w:link w:val="Heading3Char"/>
+    <w:uiPriority w:val="9"/>
+    <w:unhideWhenUsed/>
+    <w:qFormat/>
+    <w:rsid w:val="001C1452"/>
+    <w:pPr>
+      <w:keepNext/>
+      <w:keepLines/>
+      <w:spacing w:before="40" w:after="0"/>
+      <w:outlineLvl w:val="2"/>
+    </w:pPr>
+    <w:rPr>
+      <w:rFonts w:asciiTheme="majorHAnsi" w:eastAsiaTheme="majorEastAsia" w:hAnsiTheme="majorHAnsi" w:cstheme="majorBidi"/>
+      <w:color w:val="1F3763" w:themeColor="accent1" w:themeShade="7F"/>
+      <w:sz w:val="24"/>
+      <w:szCs w:val="24"/>
+    </w:rPr>
+  </w:style>
   <w:style w:type="character" w:default="1" w:styleId="DefaultParagraphFont">
     <w:name w:val="Default Paragraph Font"/>
     <w:uiPriority w:val="1"/>
+    <w:semiHidden/>
     <w:unhideWhenUsed/>
   </w:style>
   <w:style w:type="table" w:default="1" w:styleId="TableNormal">
@@ -1941,6 +3567,45 @@
       <w:ind w:left="720"/>
       <w:contextualSpacing/>
     </w:pPr>
+  </w:style>
+  <w:style w:type="character" w:customStyle="1" w:styleId="Heading1Char">
+    <w:name w:val="Heading 1 Char"/>
+    <w:basedOn w:val="DefaultParagraphFont"/>
+    <w:link w:val="Heading1"/>
+    <w:uiPriority w:val="9"/>
+    <w:rsid w:val="001C1452"/>
+    <w:rPr>
+      <w:rFonts w:asciiTheme="majorHAnsi" w:eastAsiaTheme="majorEastAsia" w:hAnsiTheme="majorHAnsi" w:cstheme="majorBidi"/>
+      <w:color w:val="2F5496" w:themeColor="accent1" w:themeShade="BF"/>
+      <w:sz w:val="32"/>
+      <w:szCs w:val="32"/>
+    </w:rPr>
+  </w:style>
+  <w:style w:type="character" w:customStyle="1" w:styleId="Heading2Char">
+    <w:name w:val="Heading 2 Char"/>
+    <w:basedOn w:val="DefaultParagraphFont"/>
+    <w:link w:val="Heading2"/>
+    <w:uiPriority w:val="9"/>
+    <w:rsid w:val="001C1452"/>
+    <w:rPr>
+      <w:rFonts w:asciiTheme="majorHAnsi" w:eastAsiaTheme="majorEastAsia" w:hAnsiTheme="majorHAnsi" w:cstheme="majorBidi"/>
+      <w:color w:val="2F5496" w:themeColor="accent1" w:themeShade="BF"/>
+      <w:sz w:val="26"/>
+      <w:szCs w:val="26"/>
+    </w:rPr>
+  </w:style>
+  <w:style w:type="character" w:customStyle="1" w:styleId="Heading3Char">
+    <w:name w:val="Heading 3 Char"/>
+    <w:basedOn w:val="DefaultParagraphFont"/>
+    <w:link w:val="Heading3"/>
+    <w:uiPriority w:val="9"/>
+    <w:rsid w:val="001C1452"/>
+    <w:rPr>
+      <w:rFonts w:asciiTheme="majorHAnsi" w:eastAsiaTheme="majorEastAsia" w:hAnsiTheme="majorHAnsi" w:cstheme="majorBidi"/>
+      <w:color w:val="1F3763" w:themeColor="accent1" w:themeShade="7F"/>
+      <w:sz w:val="24"/>
+      <w:szCs w:val="24"/>
+    </w:rPr>
   </w:style>
 </w:styles>
 </file>

</xml_diff>